<commit_message>
Add user approval & admin user directory
Introduce a user approval workflow and admin user management UI. Adds CheckUserApproval middleware, UsuarioAprobacionController and UsuarioController (approve/reject, update role, toggle status), and a migration to add is_approved to users and extra persona fields. RegisteredUserController now creates Persona records, assigns default role, marks new accounts as unapproved and exposes helpers to load hierarchical units. Adds admin views for user directory and pending approvals, updates configuration/roles UIs, and enhances admin configuraciones interactions. Seeds new permission gestionar-usuarios and marks seeded accounts approved; Kernel registers the approval middleware and models updated to include new attributes. Documentation (MANUAL.* and MANUAL_USUARIO.md) and frontend behaviors were updated to reflect the new security/module and UX changes.
</commit_message>
<xml_diff>
--- a/MANUAL.docx
+++ b/MANUAL.docx
@@ -176,7 +176,15 @@
         <w:spacing w:after="160" w:line="276" w:lineRule="auto"/>
       </w:pPr>
       <w:r>
-        <w:t>8. Pasos para Recrear el Proyecto desde Cero</w:t>
+        <w:t>8. Módulo de Seguridad y Directorio de Usuarios</w:t>
+      </w:r>
+    </w:p>
+    <w:p>
+      <w:pPr>
+        <w:spacing w:after="160" w:line="276" w:lineRule="auto"/>
+      </w:pPr>
+      <w:r>
+        <w:t>9. Pasos para Recrear el Proyecto desde Cero</w:t>
       </w:r>
     </w:p>
     <w:p>
@@ -487,13 +495,36 @@
                 <w:color w:val="0F172A"/>
                 <w:sz w:val="18"/>
               </w:rPr>
-              <w:t>// database/migrations/2023_01_01_000001_create_oficinas_table.php</w:t>
-              <w:br/>
-              <w:t>Schema::create('oficinas', function (Blueprint $table) {</w:t>
-              <w:br/>
-              <w:t xml:space="preserve">    $table-&gt;id('id_oficina');</w:t>
-              <w:br/>
-              <w:t xml:space="preserve">    $table-&gt;string('nombre_oficina', 100);</w:t>
+              <w:t>// database/migrations/2026_05_18_create_nivel_jerarquicos_table.php</w:t>
+              <w:br/>
+              <w:t>Schema::create('niveles_jerarquicos', function (Blueprint $table) {</w:t>
+              <w:br/>
+              <w:t xml:space="preserve">    $table-&gt;id();</w:t>
+              <w:br/>
+              <w:t xml:space="preserve">    $table-&gt;string('nombre')-&gt;unique(); // Ej: Sede, Departamento, Oficina</w:t>
+              <w:br/>
+              <w:t xml:space="preserve">    $table-&gt;integer('nivel'); // Ej: 1, 2, 3...</w:t>
+              <w:br/>
+              <w:t xml:space="preserve">    $table-&gt;boolean('is_active')-&gt;default(true);</w:t>
+              <w:br/>
+              <w:t xml:space="preserve">    $table-&gt;timestamps();</w:t>
+              <w:br/>
+              <w:t>});</w:t>
+              <w:br/>
+              <w:br/>
+              <w:t>// database/migrations/2026_05_18_create_unidad_administrativas_table.php</w:t>
+              <w:br/>
+              <w:t>Schema::create('unidades_administrativas', function (Blueprint $table) {</w:t>
+              <w:br/>
+              <w:t xml:space="preserve">    $table-&gt;id();</w:t>
+              <w:br/>
+              <w:t xml:space="preserve">    $table-&gt;string('nombre'); // Ej: Tecnología, Ventas</w:t>
+              <w:br/>
+              <w:t xml:space="preserve">    $table-&gt;foreignId('id_nivel')-&gt;constrained('niveles_jerarquicos')-&gt;cascadeOnDelete();</w:t>
+              <w:br/>
+              <w:t xml:space="preserve">    $table-&gt;foreignId('parent_id')-&gt;nullable()-&gt;constrained('unidades_administrativas')-&gt;cascadeOnDelete();</w:t>
+              <w:br/>
+              <w:t xml:space="preserve">    $table-&gt;boolean('is_active')-&gt;default(true);</w:t>
               <w:br/>
               <w:t xml:space="preserve">    $table-&gt;timestamps();</w:t>
               <w:br/>
@@ -641,7 +672,9 @@
               <w:br/>
               <w:t xml:space="preserve">    $table-&gt;string('telefono', 20)-&gt;nullable();</w:t>
               <w:br/>
-              <w:t xml:space="preserve">    $table-&gt;foreignId('id_oficina')-&gt;constrained('oficinas', 'id_oficina');</w:t>
+              <w:t xml:space="preserve">    $table-&gt;unsignedBigInteger('id_unidad_administrativa')-&gt;nullable();</w:t>
+              <w:br/>
+              <w:t xml:space="preserve">    $table-&gt;foreign('id_unidad_administrativa')-&gt;references('id')-&gt;on('unidades_administrativas')-&gt;nullOnDelete();</w:t>
               <w:br/>
               <w:t xml:space="preserve">    $table-&gt;timestamps();</w:t>
               <w:br/>
@@ -1963,28 +1996,16 @@
               <w:t xml:space="preserve">        $user = Auth::user();</w:t>
               <w:br/>
               <w:br/>
-              <w:t xml:space="preserve">        if ($user-&gt;hasRole('admin')) {</w:t>
-              <w:br/>
-              <w:t xml:space="preserve">            return view('admin.dashboard');</w:t>
+              <w:t xml:space="preserve">        if ($user-&gt;can('ver-panel-operativo')) {</w:t>
+              <w:br/>
+              <w:t xml:space="preserve">            return view('soporte.dashboard');</w:t>
               <w:br/>
               <w:t xml:space="preserve">        }</w:t>
               <w:br/>
-              <w:t xml:space="preserve">        if ($user-&gt;hasRole('gestor')) {</w:t>
-              <w:br/>
-              <w:t xml:space="preserve">            return view('gestor.dashboard');</w:t>
-              <w:br/>
-              <w:t xml:space="preserve">        }</w:t>
-              <w:br/>
-              <w:t xml:space="preserve">        if ($user-&gt;hasRole('tecnico')) {</w:t>
-              <w:br/>
-              <w:t xml:space="preserve">            return view('tecnico.dashboard');</w:t>
-              <w:br/>
-              <w:t xml:space="preserve">        }</w:t>
-              <w:br/>
-              <w:br/>
-              <w:t xml:space="preserve">        // Si es cliente/usuario regular</w:t>
-              <w:br/>
-              <w:t xml:space="preserve">        return view('usuario.home');</w:t>
+              <w:br/>
+              <w:t xml:space="preserve">        // Si es cliente/usuario regular se le redirige a su bandeja</w:t>
+              <w:br/>
+              <w:t xml:space="preserve">        return redirect()-&gt;route('usuario.home');</w:t>
               <w:br/>
               <w:t xml:space="preserve">    }</w:t>
               <w:br/>
@@ -3402,19 +3423,7 @@
               <w:br/>
               <w:t xml:space="preserve">                    &lt;li&gt;</w:t>
               <w:br/>
-              <w:t xml:space="preserve">                        @php</w:t>
-              <w:br/>
-              <w:t xml:space="preserve">                            $route = 'login';</w:t>
-              <w:br/>
-              <w:t xml:space="preserve">                            if(Auth::user()-&gt;hasRole('admin')) $route = 'admin.dashboard';</w:t>
-              <w:br/>
-              <w:t xml:space="preserve">                            elseif(Auth::user()-&gt;hasRole('gestor')) $route = 'gestor.dashboard';</w:t>
-              <w:br/>
-              <w:t xml:space="preserve">                            elseif(Auth::user()-&gt;hasRole('tecnico')) $route = 'tecnico.dashboard';</w:t>
-              <w:br/>
-              <w:t xml:space="preserve">                        @endphp</w:t>
-              <w:br/>
-              <w:t xml:space="preserve">                        &lt;a href="{{ route($route) }}" class="nav-link {{ request()-&gt;routeIs('*.dashboard') ? 'active' : '' }}"&gt;</w:t>
+              <w:t xml:space="preserve">                        &lt;a href="{{ route('soporte.dashboard') }}" class="nav-link {{ request()-&gt;routeIs('soporte.dashboard') ? 'active' : '' }}"&gt;</w:t>
               <w:br/>
               <w:t xml:space="preserve">                            &lt;i class="bi bi-grid-1x2-fill me-3"&gt;&lt;/i&gt;Dashboard</w:t>
               <w:br/>
@@ -3424,23 +3433,23 @@
               <w:br/>
               <w:t xml:space="preserve">                    &lt;li&gt;</w:t>
               <w:br/>
-              <w:t xml:space="preserve">                        @hasanyrole('admin|gestor')</w:t>
-              <w:br/>
-              <w:t xml:space="preserve">                            &lt;a href="{{ route('gestor.tickets.index') }}" class="nav-link {{ request()-&gt;routeIs('gestor.tickets.*') ? 'active' : '' }}"&gt;</w:t>
-              <w:br/>
-              <w:t xml:space="preserve">                                &lt;i class="bi bi-ticket-detailed-fill me-3"&gt;&lt;/i&gt;Gestión de Casos</w:t>
+              <w:t xml:space="preserve">                        @can('asignar-tickets')</w:t>
+              <w:br/>
+              <w:t xml:space="preserve">                            &lt;a href="{{ route('soporte.tickets.index') }}" class="nav-link {{ request()-&gt;routeIs('soporte.tickets.*') &amp;&amp; !request()-&gt;routeIs('soporte.tickets.tecnico.*') ? 'active' : '' }}"&gt;</w:t>
+              <w:br/>
+              <w:t xml:space="preserve">                                &lt;i class="bi bi-ticket-detailed-fill me-3"&gt;&lt;/i&gt;Mesa de Despacho</w:t>
               <w:br/>
               <w:t xml:space="preserve">                            &lt;/a&gt;</w:t>
               <w:br/>
-              <w:t xml:space="preserve">                        @else</w:t>
-              <w:br/>
-              <w:t xml:space="preserve">                            &lt;a href="{{ route('tecnico.tickets.index') }}" class="nav-link {{ request()-&gt;routeIs('tecnico.tickets.*') ? 'active' : '' }}"&gt;</w:t>
-              <w:br/>
-              <w:t xml:space="preserve">                                &lt;i class="bi bi-ticket-perforated me-3"&gt;&lt;/i&gt;Casos Asignados</w:t>
+              <w:t xml:space="preserve">                        @elsecan('resolver-tickets')</w:t>
+              <w:br/>
+              <w:t xml:space="preserve">                            &lt;a href="{{ route('soporte.tickets.tecnico.index') }}" class="nav-link {{ request()-&gt;routeIs('soporte.tickets.tecnico.*') ? 'active' : '' }}"&gt;</w:t>
+              <w:br/>
+              <w:t xml:space="preserve">                                &lt;i class="bi bi-ticket-perforated me-3"&gt;&lt;/i&gt;Mis Tareas Activas</w:t>
               <w:br/>
               <w:t xml:space="preserve">                            &lt;/a&gt;</w:t>
               <w:br/>
-              <w:t xml:space="preserve">                        @endhasanyrole</w:t>
+              <w:t xml:space="preserve">                        @endcan</w:t>
               <w:br/>
               <w:t xml:space="preserve">                    &lt;/li&gt;</w:t>
               <w:br/>
@@ -4011,7 +4020,293 @@
           <w:color w:val="475569"/>
           <w:sz w:val="28"/>
         </w:rPr>
-        <w:t>8. PASOS PARA RECREAR EL PROYECTO DESDE CERO</w:t>
+        <w:t>8. MÓDULO DE SEGURIDAD Y DIRECTORIO DE USUARIOS</w:t>
+      </w:r>
+    </w:p>
+    <w:p>
+      <w:pPr>
+        <w:spacing w:after="160" w:line="276" w:lineRule="auto"/>
+      </w:pPr>
+      <w:r>
+        <w:t>El sistema integra un módulo avanzado de administración, protegido íntegramente por permisos granulares (Spatie), diseñado para gestionar el ciclo de vida, los accesos y la aprobación de nuevos integrantes.</w:t>
+      </w:r>
+    </w:p>
+    <w:p>
+      <w:pPr>
+        <w:pStyle w:val="Heading3"/>
+        <w:keepNext/>
+        <w:spacing w:before="360" w:after="160"/>
+      </w:pPr>
+      <w:r>
+        <w:rPr>
+          <w:rFonts w:ascii="Arial" w:hAnsi="Arial"/>
+          <w:b/>
+          <w:color w:val="0F172A"/>
+          <w:sz w:val="24"/>
+        </w:rPr>
+        <w:t>8.1 Bandeja de Aprobaciones (Sala de Espera)</w:t>
+      </w:r>
+    </w:p>
+    <w:p>
+      <w:pPr>
+        <w:spacing w:after="160" w:line="276" w:lineRule="auto"/>
+      </w:pPr>
+      <w:r>
+        <w:t>Por seguridad, los nuevos registros entran por defecto en estado inactivo (</w:t>
+      </w:r>
+      <w:r>
+        <w:rPr>
+          <w:rFonts w:ascii="Courier New" w:hAnsi="Courier New"/>
+          <w:color w:val="0D6EFD"/>
+          <w:sz w:val="19"/>
+        </w:rPr>
+        <w:t>is_approved = false</w:t>
+      </w:r>
+      <w:r>
+        <w:t>) y son retenidos en una Sala de Espera.</w:t>
+      </w:r>
+    </w:p>
+    <w:p>
+      <w:pPr>
+        <w:pStyle w:val="ListBullet"/>
+        <w:spacing w:after="80"/>
+        <w:ind w:left="720"/>
+      </w:pPr>
+      <w:r/>
+      <w:r>
+        <w:rPr>
+          <w:b/>
+        </w:rPr>
+        <w:t>Middleware (`CheckUserApproval`)</w:t>
+      </w:r>
+      <w:r>
+        <w:t>: Intercepta automáticamente cualquier petición de un usuario inactivo y lo redirige a la pantalla de espera o destruye su sesión, bloqueando instantáneamente el acceso a funcionalidades protegidas.</w:t>
+      </w:r>
+    </w:p>
+    <w:p>
+      <w:pPr>
+        <w:pStyle w:val="ListBullet"/>
+        <w:spacing w:after="80"/>
+        <w:ind w:left="720"/>
+      </w:pPr>
+      <w:r/>
+      <w:r>
+        <w:rPr>
+          <w:b/>
+        </w:rPr>
+        <w:t>Aprobación/Rechazo</w:t>
+      </w:r>
+      <w:r>
+        <w:t xml:space="preserve">: A través del </w:t>
+      </w:r>
+      <w:r>
+        <w:rPr>
+          <w:rFonts w:ascii="Courier New" w:hAnsi="Courier New"/>
+          <w:color w:val="0D6EFD"/>
+          <w:sz w:val="19"/>
+        </w:rPr>
+        <w:t>UsuarioAprobacionController</w:t>
+      </w:r>
+      <w:r>
+        <w:t>, los Administradores pueden revisar la jerarquía del solicitante (Sede &gt; Complejo &gt; División) y otorgar el acceso o rechazar la cuenta.</w:t>
+      </w:r>
+    </w:p>
+    <w:p>
+      <w:pPr>
+        <w:pStyle w:val="Heading3"/>
+        <w:keepNext/>
+        <w:spacing w:before="360" w:after="160"/>
+      </w:pPr>
+      <w:r>
+        <w:rPr>
+          <w:rFonts w:ascii="Arial" w:hAnsi="Arial"/>
+          <w:b/>
+          <w:color w:val="0F172A"/>
+          <w:sz w:val="24"/>
+        </w:rPr>
+        <w:t>8.2 Directorio Activo de Gestión</w:t>
+      </w:r>
+    </w:p>
+    <w:p>
+      <w:pPr>
+        <w:spacing w:after="160" w:line="276" w:lineRule="auto"/>
+      </w:pPr>
+      <w:r>
+        <w:t>La vista administrativa de usuarios (</w:t>
+      </w:r>
+      <w:r>
+        <w:rPr>
+          <w:rFonts w:ascii="Courier New" w:hAnsi="Courier New"/>
+          <w:color w:val="0D6EFD"/>
+          <w:sz w:val="19"/>
+        </w:rPr>
+        <w:t>admin/usuarios/index.blade.php</w:t>
+      </w:r>
+      <w:r>
+        <w:t>) implementa un diseño de vanguardia y altamente reactivo:</w:t>
+      </w:r>
+    </w:p>
+    <w:p>
+      <w:pPr>
+        <w:pStyle w:val="ListBullet"/>
+        <w:spacing w:after="80"/>
+        <w:ind w:left="720"/>
+      </w:pPr>
+      <w:r/>
+      <w:r>
+        <w:rPr>
+          <w:b/>
+        </w:rPr>
+        <w:t>Filtro Asíncrono (Fuzzy Search)</w:t>
+      </w:r>
+      <w:r>
+        <w:t>: Búsqueda dinámica en el frontend (JavaScript Vanilla) por nombre, correo electrónico o número de cédula, sin necesidad de recargas de página ni llamadas pesadas a la base de datos.</w:t>
+      </w:r>
+    </w:p>
+    <w:p>
+      <w:pPr>
+        <w:pStyle w:val="ListBullet"/>
+        <w:spacing w:after="80"/>
+        <w:ind w:left="720"/>
+      </w:pPr>
+      <w:r/>
+      <w:r>
+        <w:rPr>
+          <w:b/>
+        </w:rPr>
+        <w:t>Gestor Dinámico de Roles</w:t>
+      </w:r>
+      <w:r>
+        <w:t>: Permite actualizar en caliente el rol operativo (Admin, Gestor, Técnico, Usuario) mediante un modal superpuesto elegante.</w:t>
+      </w:r>
+    </w:p>
+    <w:p>
+      <w:pPr>
+        <w:pStyle w:val="ListBullet"/>
+        <w:spacing w:after="80"/>
+        <w:ind w:left="720"/>
+      </w:pPr>
+      <w:r/>
+      <w:r>
+        <w:rPr>
+          <w:b/>
+        </w:rPr>
+        <w:t>Interruptor de Acceso (AJAX)</w:t>
+      </w:r>
+      <w:r>
+        <w:t xml:space="preserve">: Activación y desactivación inmediata de las cuentas a través de un switch estilo Toggle que se comunica asíncronamente (vía </w:t>
+      </w:r>
+      <w:r>
+        <w:rPr>
+          <w:rFonts w:ascii="Courier New" w:hAnsi="Courier New"/>
+          <w:color w:val="0D6EFD"/>
+          <w:sz w:val="19"/>
+        </w:rPr>
+        <w:t>fetch</w:t>
+      </w:r>
+      <w:r>
+        <w:t xml:space="preserve"> API) con el backend (</w:t>
+      </w:r>
+      <w:r>
+        <w:rPr>
+          <w:rFonts w:ascii="Courier New" w:hAnsi="Courier New"/>
+          <w:color w:val="0D6EFD"/>
+          <w:sz w:val="19"/>
+        </w:rPr>
+        <w:t>UsuarioController@toggleStatus</w:t>
+      </w:r>
+      <w:r>
+        <w:t>). Una cuenta desactivada expulsa de inmediato al usuario en su siguiente petición de red.</w:t>
+      </w:r>
+    </w:p>
+    <w:p>
+      <w:pPr>
+        <w:pStyle w:val="Heading3"/>
+        <w:keepNext/>
+        <w:spacing w:before="360" w:after="160"/>
+      </w:pPr>
+      <w:r>
+        <w:rPr>
+          <w:rFonts w:ascii="Arial" w:hAnsi="Arial"/>
+          <w:b/>
+          <w:color w:val="0F172A"/>
+          <w:sz w:val="24"/>
+        </w:rPr>
+        <w:t>8.3 Permiso Estricto (`gestionar-usuarios`)</w:t>
+      </w:r>
+    </w:p>
+    <w:p>
+      <w:pPr>
+        <w:spacing w:after="160" w:line="276" w:lineRule="auto"/>
+      </w:pPr>
+      <w:r>
+        <w:t xml:space="preserve">Toda la lógica de Aprobación y Directorio está contenida en un subgrupo de rutas en </w:t>
+      </w:r>
+      <w:r>
+        <w:rPr>
+          <w:rFonts w:ascii="Courier New" w:hAnsi="Courier New"/>
+          <w:color w:val="0D6EFD"/>
+          <w:sz w:val="19"/>
+        </w:rPr>
+        <w:t>routes/web.php</w:t>
+      </w:r>
+      <w:r>
+        <w:t xml:space="preserve"> amparado por un middleware que exige explícitamente el permiso </w:t>
+      </w:r>
+      <w:r>
+        <w:rPr>
+          <w:rFonts w:ascii="Courier New" w:hAnsi="Courier New"/>
+          <w:color w:val="0D6EFD"/>
+          <w:sz w:val="19"/>
+        </w:rPr>
+        <w:t>gestionar-usuarios</w:t>
+      </w:r>
+      <w:r>
+        <w:t>.</w:t>
+      </w:r>
+    </w:p>
+    <w:p>
+      <w:pPr>
+        <w:pStyle w:val="ListBullet"/>
+        <w:spacing w:after="80"/>
+        <w:ind w:left="720"/>
+      </w:pPr>
+      <w:r>
+        <w:t>Esto disocia el poder de "gestionar roles" del de "gestionar cuentas", permitiendo una delegación de responsabilidades más fina en el futuro.</w:t>
+      </w:r>
+    </w:p>
+    <w:p>
+      <w:pPr>
+        <w:pStyle w:val="ListBullet"/>
+        <w:spacing w:after="80"/>
+        <w:ind w:left="720"/>
+      </w:pPr>
+      <w:r>
+        <w:t>La UI del menú lateral de administrador evalúa este permiso dinámicamente antes de renderizar los enlaces.</w:t>
+      </w:r>
+    </w:p>
+    <w:p>
+      <w:pPr>
+        <w:spacing w:after="160" w:line="276" w:lineRule="auto"/>
+      </w:pPr>
+      <w:r>
+        <w:t>---</w:t>
+      </w:r>
+    </w:p>
+    <w:p>
+      <w:pPr>
+        <w:pStyle w:val="Heading2"/>
+        <w:keepNext/>
+        <w:spacing w:before="360" w:after="160"/>
+      </w:pPr>
+      <w:r>
+        <w:rPr>
+          <w:rFonts w:ascii="Arial" w:hAnsi="Arial"/>
+          <w:b/>
+          <w:color w:val="475569"/>
+          <w:sz w:val="28"/>
+        </w:rPr>
+        <w:t>9. PASOS PARA RECREAR EL PROYECTO DESDE CERO</w:t>
       </w:r>
     </w:p>
     <w:p>

</xml_diff>